<commit_message>
docs: fix stale AI-backend/provider/IOCType counts found during hackathon doc audit
Several technical-reference chapters still said "4-6 AI backends" and "16
providers"/"31 IOCType values" from before the v0.2.0 expansion, contradicting
the README's already-correct 11-backend/18-provider/32-IOCType figures.
Verified current counts directly against runtime_config.py, registry.py, and
ioc/types.py before fixing. Rebuilt every PDF/DOCX these chapters feed
(FINAL_PRODUCT_DOCUMENTATION, BACKEND_DOCUMENTATION, SOURCE_CODE_GUIDE,
FUNCTION_REFERENCE, TECHNICAL_ARCHITECTURE) so the correction reaches the
shipped artifacts, not just the source markdown.
</commit_message>
<xml_diff>
--- a/documentation/HORIZON_GRID_FUNCTION_REFERENCE.docx
+++ b/documentation/HORIZON_GRID_FUNCTION_REFERENCE.docx
@@ -6426,7 +6426,7 @@
             </w:pPr>
             <w:r>
               <w:rPr/>
-              <w:t xml:space="preserve">Choose which AI backend (Ollama, Claude/Anthropic, AWS Bedrock, Gemini, or Groq) will analyze the </w:t>
+              <w:t xml:space="preserve">Choose which AI backend (Ollama, Claude/Anthropic, AWS Bedrock, Gemini, Groq, OpenAI, Kimi, DeepSeek, xAI, Mistral, or OpenRouter) will analyze the </w:t>
             </w:r>
           </w:p>
           <w:p>
@@ -44965,7 +44965,7 @@
             </w:pPr>
             <w:r>
               <w:rPr/>
-              <w:t xml:space="preserve">Enter or update the credentials for one AI backend (Ollama, Anthropic/Claude, AWS Bedrock, Gemini, Groq).</w:t>
+              <w:t xml:space="preserve">Enter or update the credentials for one AI backend (Ollama, Anthropic/Claude, AWS Bedrock, Gemini, Groq, OpenAI, Kimi, DeepSeek, xAI, Mistral, or OpenRouter).</w:t>
             </w:r>
           </w:p>
         </w:tc>

</xml_diff>